<commit_message>
docs: fill in real team details (BITS IDs, names, equal 25% contribution)
Updated the cover table in README.md, 13.docx/13.pdf, and 13.ipynb:

1. 2025ae05576  Anirudh Anand            - report lead, Sections 1-2, Business View
2. 2025ae05178  Aniketh Paul             - GR4ML Analytics/Data Prep views, QAs, data pipeline
3. 2025ae05898  Pushadapu Sanjay Kumar   - architecture diagram, patterns, FastAPI, tests
4. 2025af05111  Biswajeet Mahato (Lead)  - model pipeline, MLflow, end-to-end run, screenshots

Equal 25% contribution each. Regenerated 13.docx/13.pdf (schema-valid,
page-checked) and re-executed 13.ipynb (0 errors, 6 plots) against the
live stack.
</commit_message>
<xml_diff>
--- a/13.docx
+++ b/13.docx
@@ -119,11 +119,11 @@
         </w:tblBorders>
       </w:tblPr>
       <w:tblGrid>
-        <w:gridCol w:w="615"/>
-        <w:gridCol w:w="1435"/>
-        <w:gridCol w:w="2051"/>
-        <w:gridCol w:w="4101"/>
-        <w:gridCol w:w="1435"/>
+        <w:gridCol w:w="507"/>
+        <w:gridCol w:w="1217"/>
+        <w:gridCol w:w="1826"/>
+        <w:gridCol w:w="5174"/>
+        <w:gridCol w:w="913"/>
       </w:tblGrid>
       <w:tr>
         <w:trPr>
@@ -131,7 +131,7 @@
         </w:trPr>
         <w:tc>
           <w:tcPr>
-            <w:tcW w:type="dxa" w:w="615"/>
+            <w:tcW w:type="dxa" w:w="507"/>
             <w:shd w:fill="2F5496" w:val="clear"/>
             <w:tcMar>
               <w:top w:type="dxa" w:w="80"/>
@@ -160,7 +160,7 @@
         </w:tc>
         <w:tc>
           <w:tcPr>
-            <w:tcW w:type="dxa" w:w="1435"/>
+            <w:tcW w:type="dxa" w:w="1217"/>
             <w:shd w:fill="2F5496" w:val="clear"/>
             <w:tcMar>
               <w:top w:type="dxa" w:w="80"/>
@@ -189,7 +189,7 @@
         </w:tc>
         <w:tc>
           <w:tcPr>
-            <w:tcW w:type="dxa" w:w="2051"/>
+            <w:tcW w:type="dxa" w:w="1826"/>
             <w:shd w:fill="2F5496" w:val="clear"/>
             <w:tcMar>
               <w:top w:type="dxa" w:w="80"/>
@@ -218,7 +218,7 @@
         </w:tc>
         <w:tc>
           <w:tcPr>
-            <w:tcW w:type="dxa" w:w="4101"/>
+            <w:tcW w:type="dxa" w:w="5174"/>
             <w:shd w:fill="2F5496" w:val="clear"/>
             <w:tcMar>
               <w:top w:type="dxa" w:w="80"/>
@@ -247,7 +247,7 @@
         </w:tc>
         <w:tc>
           <w:tcPr>
-            <w:tcW w:type="dxa" w:w="1435"/>
+            <w:tcW w:type="dxa" w:w="913"/>
             <w:shd w:fill="2F5496" w:val="clear"/>
             <w:tcMar>
               <w:top w:type="dxa" w:w="80"/>
@@ -278,7 +278,7 @@
       <w:tr>
         <w:tc>
           <w:tcPr>
-            <w:tcW w:type="dxa" w:w="615"/>
+            <w:tcW w:type="dxa" w:w="507"/>
             <w:tcMar>
               <w:top w:type="dxa" w:w="80"/>
               <w:left w:type="dxa" w:w="100"/>
@@ -305,109 +305,109 @@
         </w:tc>
         <w:tc>
           <w:tcPr>
-            <w:tcW w:type="dxa" w:w="1435"/>
-            <w:tcMar>
-              <w:top w:type="dxa" w:w="80"/>
-              <w:left w:type="dxa" w:w="100"/>
-              <w:bottom w:type="dxa" w:w="80"/>
-              <w:right w:type="dxa" w:w="100"/>
-            </w:tcMar>
-          </w:tcPr>
-          <w:p>
-            <w:pPr>
-              <w:jc w:val="left"/>
-            </w:pPr>
-            <w:r>
-              <w:rPr>
-                <w:b w:val="false"/>
-                <w:bCs w:val="false"/>
-                <w:i w:val="false"/>
-                <w:iCs w:val="false"/>
-                <w:sz w:val="20"/>
-                <w:szCs w:val="20"/>
-              </w:rPr>
-              <w:t xml:space="preserve">&lt;BITS_ID_1&gt;</w:t>
-            </w:r>
-          </w:p>
-        </w:tc>
-        <w:tc>
-          <w:tcPr>
-            <w:tcW w:type="dxa" w:w="2051"/>
-            <w:tcMar>
-              <w:top w:type="dxa" w:w="80"/>
-              <w:left w:type="dxa" w:w="100"/>
-              <w:bottom w:type="dxa" w:w="80"/>
-              <w:right w:type="dxa" w:w="100"/>
-            </w:tcMar>
-          </w:tcPr>
-          <w:p>
-            <w:pPr>
-              <w:jc w:val="left"/>
-            </w:pPr>
-            <w:r>
-              <w:rPr>
-                <w:b w:val="false"/>
-                <w:bCs w:val="false"/>
-                <w:i w:val="false"/>
-                <w:iCs w:val="false"/>
-                <w:sz w:val="20"/>
-                <w:szCs w:val="20"/>
-              </w:rPr>
-              <w:t xml:space="preserve">&lt;NAME_1&gt; (Lead)</w:t>
-            </w:r>
-          </w:p>
-        </w:tc>
-        <w:tc>
-          <w:tcPr>
-            <w:tcW w:type="dxa" w:w="4101"/>
-            <w:tcMar>
-              <w:top w:type="dxa" w:w="80"/>
-              <w:left w:type="dxa" w:w="100"/>
-              <w:bottom w:type="dxa" w:w="80"/>
-              <w:right w:type="dxa" w:w="100"/>
-            </w:tcMar>
-          </w:tcPr>
-          <w:p>
-            <w:pPr>
-              <w:jc w:val="left"/>
-            </w:pPr>
-            <w:r>
-              <w:rPr>
-                <w:b w:val="false"/>
-                <w:bCs w:val="false"/>
-                <w:i w:val="false"/>
-                <w:iCs w:val="false"/>
-                <w:sz w:val="20"/>
-                <w:szCs w:val="20"/>
-              </w:rPr>
-              <w:t xml:space="preserve">&lt;TBD&gt;</w:t>
-            </w:r>
-          </w:p>
-        </w:tc>
-        <w:tc>
-          <w:tcPr>
-            <w:tcW w:type="dxa" w:w="1435"/>
-            <w:tcMar>
-              <w:top w:type="dxa" w:w="80"/>
-              <w:left w:type="dxa" w:w="100"/>
-              <w:bottom w:type="dxa" w:w="80"/>
-              <w:right w:type="dxa" w:w="100"/>
-            </w:tcMar>
-          </w:tcPr>
-          <w:p>
-            <w:pPr>
-              <w:jc w:val="left"/>
-            </w:pPr>
-            <w:r>
-              <w:rPr>
-                <w:b w:val="false"/>
-                <w:bCs w:val="false"/>
-                <w:i w:val="false"/>
-                <w:iCs w:val="false"/>
-                <w:sz w:val="20"/>
-                <w:szCs w:val="20"/>
-              </w:rPr>
-              <w:t xml:space="preserve">&lt;TBD&gt;</w:t>
+            <w:tcW w:type="dxa" w:w="1217"/>
+            <w:tcMar>
+              <w:top w:type="dxa" w:w="80"/>
+              <w:left w:type="dxa" w:w="100"/>
+              <w:bottom w:type="dxa" w:w="80"/>
+              <w:right w:type="dxa" w:w="100"/>
+            </w:tcMar>
+          </w:tcPr>
+          <w:p>
+            <w:pPr>
+              <w:jc w:val="left"/>
+            </w:pPr>
+            <w:r>
+              <w:rPr>
+                <w:b w:val="false"/>
+                <w:bCs w:val="false"/>
+                <w:i w:val="false"/>
+                <w:iCs w:val="false"/>
+                <w:sz w:val="20"/>
+                <w:szCs w:val="20"/>
+              </w:rPr>
+              <w:t xml:space="preserve">2025ae05576</w:t>
+            </w:r>
+          </w:p>
+        </w:tc>
+        <w:tc>
+          <w:tcPr>
+            <w:tcW w:type="dxa" w:w="1826"/>
+            <w:tcMar>
+              <w:top w:type="dxa" w:w="80"/>
+              <w:left w:type="dxa" w:w="100"/>
+              <w:bottom w:type="dxa" w:w="80"/>
+              <w:right w:type="dxa" w:w="100"/>
+            </w:tcMar>
+          </w:tcPr>
+          <w:p>
+            <w:pPr>
+              <w:jc w:val="left"/>
+            </w:pPr>
+            <w:r>
+              <w:rPr>
+                <w:b w:val="false"/>
+                <w:bCs w:val="false"/>
+                <w:i w:val="false"/>
+                <w:iCs w:val="false"/>
+                <w:sz w:val="20"/>
+                <w:szCs w:val="20"/>
+              </w:rPr>
+              <w:t xml:space="preserve">Anirudh Anand</w:t>
+            </w:r>
+          </w:p>
+        </w:tc>
+        <w:tc>
+          <w:tcPr>
+            <w:tcW w:type="dxa" w:w="5174"/>
+            <w:tcMar>
+              <w:top w:type="dxa" w:w="80"/>
+              <w:left w:type="dxa" w:w="100"/>
+              <w:bottom w:type="dxa" w:w="80"/>
+              <w:right w:type="dxa" w:w="100"/>
+            </w:tcMar>
+          </w:tcPr>
+          <w:p>
+            <w:pPr>
+              <w:jc w:val="left"/>
+            </w:pPr>
+            <w:r>
+              <w:rPr>
+                <w:b w:val="false"/>
+                <w:bCs w:val="false"/>
+                <w:i w:val="false"/>
+                <w:iCs w:val="false"/>
+                <w:sz w:val="20"/>
+                <w:szCs w:val="20"/>
+              </w:rPr>
+              <w:t xml:space="preserve">Report lead. Domain and problem statement, ML formulation, requirements and measurable goals (Sections 1 and 2), Business View, final report and PDF.</w:t>
+            </w:r>
+          </w:p>
+        </w:tc>
+        <w:tc>
+          <w:tcPr>
+            <w:tcW w:type="dxa" w:w="913"/>
+            <w:tcMar>
+              <w:top w:type="dxa" w:w="80"/>
+              <w:left w:type="dxa" w:w="100"/>
+              <w:bottom w:type="dxa" w:w="80"/>
+              <w:right w:type="dxa" w:w="100"/>
+            </w:tcMar>
+          </w:tcPr>
+          <w:p>
+            <w:pPr>
+              <w:jc w:val="left"/>
+            </w:pPr>
+            <w:r>
+              <w:rPr>
+                <w:b w:val="false"/>
+                <w:bCs w:val="false"/>
+                <w:i w:val="false"/>
+                <w:iCs w:val="false"/>
+                <w:sz w:val="20"/>
+                <w:szCs w:val="20"/>
+              </w:rPr>
+              <w:t xml:space="preserve">25</w:t>
             </w:r>
           </w:p>
         </w:tc>
@@ -415,7 +415,7 @@
       <w:tr>
         <w:tc>
           <w:tcPr>
-            <w:tcW w:type="dxa" w:w="615"/>
+            <w:tcW w:type="dxa" w:w="507"/>
             <w:shd w:fill="F2F2F2" w:val="clear"/>
             <w:tcMar>
               <w:top w:type="dxa" w:w="80"/>
@@ -443,7 +443,7 @@
         </w:tc>
         <w:tc>
           <w:tcPr>
-            <w:tcW w:type="dxa" w:w="1435"/>
+            <w:tcW w:type="dxa" w:w="1217"/>
             <w:shd w:fill="F2F2F2" w:val="clear"/>
             <w:tcMar>
               <w:top w:type="dxa" w:w="80"/>
@@ -465,13 +465,13 @@
                 <w:sz w:val="20"/>
                 <w:szCs w:val="20"/>
               </w:rPr>
-              <w:t xml:space="preserve">&lt;BITS_ID_2&gt;</w:t>
-            </w:r>
-          </w:p>
-        </w:tc>
-        <w:tc>
-          <w:tcPr>
-            <w:tcW w:type="dxa" w:w="2051"/>
+              <w:t xml:space="preserve">2025ae05178</w:t>
+            </w:r>
+          </w:p>
+        </w:tc>
+        <w:tc>
+          <w:tcPr>
+            <w:tcW w:type="dxa" w:w="1826"/>
             <w:shd w:fill="F2F2F2" w:val="clear"/>
             <w:tcMar>
               <w:top w:type="dxa" w:w="80"/>
@@ -493,13 +493,13 @@
                 <w:sz w:val="20"/>
                 <w:szCs w:val="20"/>
               </w:rPr>
-              <w:t xml:space="preserve">&lt;NAME_2&gt;</w:t>
-            </w:r>
-          </w:p>
-        </w:tc>
-        <w:tc>
-          <w:tcPr>
-            <w:tcW w:type="dxa" w:w="4101"/>
+              <w:t xml:space="preserve">Aniketh Paul</w:t>
+            </w:r>
+          </w:p>
+        </w:tc>
+        <w:tc>
+          <w:tcPr>
+            <w:tcW w:type="dxa" w:w="5174"/>
             <w:shd w:fill="F2F2F2" w:val="clear"/>
             <w:tcMar>
               <w:top w:type="dxa" w:w="80"/>
@@ -521,13 +521,13 @@
                 <w:sz w:val="20"/>
                 <w:szCs w:val="20"/>
               </w:rPr>
-              <w:t xml:space="preserve">&lt;TBD&gt;</w:t>
-            </w:r>
-          </w:p>
-        </w:tc>
-        <w:tc>
-          <w:tcPr>
-            <w:tcW w:type="dxa" w:w="1435"/>
+              <w:t xml:space="preserve">GR4ML Analytics Design and Data Preparation views, top three quality requirements (Sections 3.2, 3.3, 4). Data part of the pipeline: EDA, ingest, clean, features, split.</w:t>
+            </w:r>
+          </w:p>
+        </w:tc>
+        <w:tc>
+          <w:tcPr>
+            <w:tcW w:type="dxa" w:w="913"/>
             <w:shd w:fill="F2F2F2" w:val="clear"/>
             <w:tcMar>
               <w:top w:type="dxa" w:w="80"/>
@@ -549,7 +549,7 @@
                 <w:sz w:val="20"/>
                 <w:szCs w:val="20"/>
               </w:rPr>
-              <w:t xml:space="preserve">&lt;TBD&gt;</w:t>
+              <w:t xml:space="preserve">25</w:t>
             </w:r>
           </w:p>
         </w:tc>
@@ -557,7 +557,7 @@
       <w:tr>
         <w:tc>
           <w:tcPr>
-            <w:tcW w:type="dxa" w:w="615"/>
+            <w:tcW w:type="dxa" w:w="507"/>
             <w:tcMar>
               <w:top w:type="dxa" w:w="80"/>
               <w:left w:type="dxa" w:w="100"/>
@@ -584,109 +584,109 @@
         </w:tc>
         <w:tc>
           <w:tcPr>
-            <w:tcW w:type="dxa" w:w="1435"/>
-            <w:tcMar>
-              <w:top w:type="dxa" w:w="80"/>
-              <w:left w:type="dxa" w:w="100"/>
-              <w:bottom w:type="dxa" w:w="80"/>
-              <w:right w:type="dxa" w:w="100"/>
-            </w:tcMar>
-          </w:tcPr>
-          <w:p>
-            <w:pPr>
-              <w:jc w:val="left"/>
-            </w:pPr>
-            <w:r>
-              <w:rPr>
-                <w:b w:val="false"/>
-                <w:bCs w:val="false"/>
-                <w:i w:val="false"/>
-                <w:iCs w:val="false"/>
-                <w:sz w:val="20"/>
-                <w:szCs w:val="20"/>
-              </w:rPr>
-              <w:t xml:space="preserve">&lt;BITS_ID_3&gt;</w:t>
-            </w:r>
-          </w:p>
-        </w:tc>
-        <w:tc>
-          <w:tcPr>
-            <w:tcW w:type="dxa" w:w="2051"/>
-            <w:tcMar>
-              <w:top w:type="dxa" w:w="80"/>
-              <w:left w:type="dxa" w:w="100"/>
-              <w:bottom w:type="dxa" w:w="80"/>
-              <w:right w:type="dxa" w:w="100"/>
-            </w:tcMar>
-          </w:tcPr>
-          <w:p>
-            <w:pPr>
-              <w:jc w:val="left"/>
-            </w:pPr>
-            <w:r>
-              <w:rPr>
-                <w:b w:val="false"/>
-                <w:bCs w:val="false"/>
-                <w:i w:val="false"/>
-                <w:iCs w:val="false"/>
-                <w:sz w:val="20"/>
-                <w:szCs w:val="20"/>
-              </w:rPr>
-              <w:t xml:space="preserve">&lt;NAME_3&gt;</w:t>
-            </w:r>
-          </w:p>
-        </w:tc>
-        <w:tc>
-          <w:tcPr>
-            <w:tcW w:type="dxa" w:w="4101"/>
-            <w:tcMar>
-              <w:top w:type="dxa" w:w="80"/>
-              <w:left w:type="dxa" w:w="100"/>
-              <w:bottom w:type="dxa" w:w="80"/>
-              <w:right w:type="dxa" w:w="100"/>
-            </w:tcMar>
-          </w:tcPr>
-          <w:p>
-            <w:pPr>
-              <w:jc w:val="left"/>
-            </w:pPr>
-            <w:r>
-              <w:rPr>
-                <w:b w:val="false"/>
-                <w:bCs w:val="false"/>
-                <w:i w:val="false"/>
-                <w:iCs w:val="false"/>
-                <w:sz w:val="20"/>
-                <w:szCs w:val="20"/>
-              </w:rPr>
-              <w:t xml:space="preserve">&lt;TBD&gt;</w:t>
-            </w:r>
-          </w:p>
-        </w:tc>
-        <w:tc>
-          <w:tcPr>
-            <w:tcW w:type="dxa" w:w="1435"/>
-            <w:tcMar>
-              <w:top w:type="dxa" w:w="80"/>
-              <w:left w:type="dxa" w:w="100"/>
-              <w:bottom w:type="dxa" w:w="80"/>
-              <w:right w:type="dxa" w:w="100"/>
-            </w:tcMar>
-          </w:tcPr>
-          <w:p>
-            <w:pPr>
-              <w:jc w:val="left"/>
-            </w:pPr>
-            <w:r>
-              <w:rPr>
-                <w:b w:val="false"/>
-                <w:bCs w:val="false"/>
-                <w:i w:val="false"/>
-                <w:iCs w:val="false"/>
-                <w:sz w:val="20"/>
-                <w:szCs w:val="20"/>
-              </w:rPr>
-              <w:t xml:space="preserve">&lt;TBD&gt;</w:t>
+            <w:tcW w:type="dxa" w:w="1217"/>
+            <w:tcMar>
+              <w:top w:type="dxa" w:w="80"/>
+              <w:left w:type="dxa" w:w="100"/>
+              <w:bottom w:type="dxa" w:w="80"/>
+              <w:right w:type="dxa" w:w="100"/>
+            </w:tcMar>
+          </w:tcPr>
+          <w:p>
+            <w:pPr>
+              <w:jc w:val="left"/>
+            </w:pPr>
+            <w:r>
+              <w:rPr>
+                <w:b w:val="false"/>
+                <w:bCs w:val="false"/>
+                <w:i w:val="false"/>
+                <w:iCs w:val="false"/>
+                <w:sz w:val="20"/>
+                <w:szCs w:val="20"/>
+              </w:rPr>
+              <w:t xml:space="preserve">2025ae05898</w:t>
+            </w:r>
+          </w:p>
+        </w:tc>
+        <w:tc>
+          <w:tcPr>
+            <w:tcW w:type="dxa" w:w="1826"/>
+            <w:tcMar>
+              <w:top w:type="dxa" w:w="80"/>
+              <w:left w:type="dxa" w:w="100"/>
+              <w:bottom w:type="dxa" w:w="80"/>
+              <w:right w:type="dxa" w:w="100"/>
+            </w:tcMar>
+          </w:tcPr>
+          <w:p>
+            <w:pPr>
+              <w:jc w:val="left"/>
+            </w:pPr>
+            <w:r>
+              <w:rPr>
+                <w:b w:val="false"/>
+                <w:bCs w:val="false"/>
+                <w:i w:val="false"/>
+                <w:iCs w:val="false"/>
+                <w:sz w:val="20"/>
+                <w:szCs w:val="20"/>
+              </w:rPr>
+              <w:t xml:space="preserve">Pushadapu Sanjay Kumar</w:t>
+            </w:r>
+          </w:p>
+        </w:tc>
+        <w:tc>
+          <w:tcPr>
+            <w:tcW w:type="dxa" w:w="5174"/>
+            <w:tcMar>
+              <w:top w:type="dxa" w:w="80"/>
+              <w:left w:type="dxa" w:w="100"/>
+              <w:bottom w:type="dxa" w:w="80"/>
+              <w:right w:type="dxa" w:w="100"/>
+            </w:tcMar>
+          </w:tcPr>
+          <w:p>
+            <w:pPr>
+              <w:jc w:val="left"/>
+            </w:pPr>
+            <w:r>
+              <w:rPr>
+                <w:b w:val="false"/>
+                <w:bCs w:val="false"/>
+                <w:i w:val="false"/>
+                <w:iCs w:val="false"/>
+                <w:sz w:val="20"/>
+                <w:szCs w:val="20"/>
+              </w:rPr>
+              <w:t xml:space="preserve">Architecture diagram (ML and non-ML components), the two patterns (Sections 5 and 6). FastAPI service, input validation, prediction logging, automated tests.</w:t>
+            </w:r>
+          </w:p>
+        </w:tc>
+        <w:tc>
+          <w:tcPr>
+            <w:tcW w:type="dxa" w:w="913"/>
+            <w:tcMar>
+              <w:top w:type="dxa" w:w="80"/>
+              <w:left w:type="dxa" w:w="100"/>
+              <w:bottom w:type="dxa" w:w="80"/>
+              <w:right w:type="dxa" w:w="100"/>
+            </w:tcMar>
+          </w:tcPr>
+          <w:p>
+            <w:pPr>
+              <w:jc w:val="left"/>
+            </w:pPr>
+            <w:r>
+              <w:rPr>
+                <w:b w:val="false"/>
+                <w:bCs w:val="false"/>
+                <w:i w:val="false"/>
+                <w:iCs w:val="false"/>
+                <w:sz w:val="20"/>
+                <w:szCs w:val="20"/>
+              </w:rPr>
+              <w:t xml:space="preserve">25</w:t>
             </w:r>
           </w:p>
         </w:tc>
@@ -694,7 +694,7 @@
       <w:tr>
         <w:tc>
           <w:tcPr>
-            <w:tcW w:type="dxa" w:w="615"/>
+            <w:tcW w:type="dxa" w:w="507"/>
             <w:shd w:fill="F2F2F2" w:val="clear"/>
             <w:tcMar>
               <w:top w:type="dxa" w:w="80"/>
@@ -722,7 +722,7 @@
         </w:tc>
         <w:tc>
           <w:tcPr>
-            <w:tcW w:type="dxa" w:w="1435"/>
+            <w:tcW w:type="dxa" w:w="1217"/>
             <w:shd w:fill="F2F2F2" w:val="clear"/>
             <w:tcMar>
               <w:top w:type="dxa" w:w="80"/>
@@ -744,13 +744,13 @@
                 <w:sz w:val="20"/>
                 <w:szCs w:val="20"/>
               </w:rPr>
-              <w:t xml:space="preserve">&lt;BITS_ID_4&gt;</w:t>
-            </w:r>
-          </w:p>
-        </w:tc>
-        <w:tc>
-          <w:tcPr>
-            <w:tcW w:type="dxa" w:w="2051"/>
+              <w:t xml:space="preserve">2025af05111</w:t>
+            </w:r>
+          </w:p>
+        </w:tc>
+        <w:tc>
+          <w:tcPr>
+            <w:tcW w:type="dxa" w:w="1826"/>
             <w:shd w:fill="F2F2F2" w:val="clear"/>
             <w:tcMar>
               <w:top w:type="dxa" w:w="80"/>
@@ -772,13 +772,13 @@
                 <w:sz w:val="20"/>
                 <w:szCs w:val="20"/>
               </w:rPr>
-              <w:t xml:space="preserve">&lt;NAME_4&gt;</w:t>
-            </w:r>
-          </w:p>
-        </w:tc>
-        <w:tc>
-          <w:tcPr>
-            <w:tcW w:type="dxa" w:w="4101"/>
+              <w:t xml:space="preserve">Biswajeet Mahato (Group Lead)</w:t>
+            </w:r>
+          </w:p>
+        </w:tc>
+        <w:tc>
+          <w:tcPr>
+            <w:tcW w:type="dxa" w:w="5174"/>
             <w:shd w:fill="F2F2F2" w:val="clear"/>
             <w:tcMar>
               <w:top w:type="dxa" w:w="80"/>
@@ -800,13 +800,13 @@
                 <w:sz w:val="20"/>
                 <w:szCs w:val="20"/>
               </w:rPr>
-              <w:t xml:space="preserve">&lt;TBD&gt;</w:t>
-            </w:r>
-          </w:p>
-        </w:tc>
-        <w:tc>
-          <w:tcPr>
-            <w:tcW w:type="dxa" w:w="1435"/>
+              <w:t xml:space="preserve">Model part of the pipeline: train and evaluate filters, threshold on validation, MLflow tracking and registry. End-to-end run, screenshots, Sections 7.2, 7.3, 8, 9.</w:t>
+            </w:r>
+          </w:p>
+        </w:tc>
+        <w:tc>
+          <w:tcPr>
+            <w:tcW w:type="dxa" w:w="913"/>
             <w:shd w:fill="F2F2F2" w:val="clear"/>
             <w:tcMar>
               <w:top w:type="dxa" w:w="80"/>
@@ -828,7 +828,144 @@
                 <w:sz w:val="20"/>
                 <w:szCs w:val="20"/>
               </w:rPr>
-              <w:t xml:space="preserve">&lt;TBD&gt;</w:t>
+              <w:t xml:space="preserve">25</w:t>
+            </w:r>
+          </w:p>
+        </w:tc>
+      </w:tr>
+      <w:tr>
+        <w:tc>
+          <w:tcPr>
+            <w:tcW w:type="dxa" w:w="507"/>
+            <w:tcMar>
+              <w:top w:type="dxa" w:w="80"/>
+              <w:left w:type="dxa" w:w="100"/>
+              <w:bottom w:type="dxa" w:w="80"/>
+              <w:right w:type="dxa" w:w="100"/>
+            </w:tcMar>
+          </w:tcPr>
+          <w:p>
+            <w:pPr>
+              <w:jc w:val="left"/>
+            </w:pPr>
+            <w:r>
+              <w:rPr>
+                <w:b w:val="false"/>
+                <w:bCs w:val="false"/>
+                <w:i w:val="false"/>
+                <w:iCs w:val="false"/>
+                <w:sz w:val="20"/>
+                <w:szCs w:val="20"/>
+              </w:rPr>
+              <w:t xml:space="preserve"/>
+            </w:r>
+          </w:p>
+        </w:tc>
+        <w:tc>
+          <w:tcPr>
+            <w:tcW w:type="dxa" w:w="1217"/>
+            <w:tcMar>
+              <w:top w:type="dxa" w:w="80"/>
+              <w:left w:type="dxa" w:w="100"/>
+              <w:bottom w:type="dxa" w:w="80"/>
+              <w:right w:type="dxa" w:w="100"/>
+            </w:tcMar>
+          </w:tcPr>
+          <w:p>
+            <w:pPr>
+              <w:jc w:val="left"/>
+            </w:pPr>
+            <w:r>
+              <w:rPr>
+                <w:b w:val="false"/>
+                <w:bCs w:val="false"/>
+                <w:i w:val="false"/>
+                <w:iCs w:val="false"/>
+                <w:sz w:val="20"/>
+                <w:szCs w:val="20"/>
+              </w:rPr>
+              <w:t xml:space="preserve"/>
+            </w:r>
+          </w:p>
+        </w:tc>
+        <w:tc>
+          <w:tcPr>
+            <w:tcW w:type="dxa" w:w="1826"/>
+            <w:tcMar>
+              <w:top w:type="dxa" w:w="80"/>
+              <w:left w:type="dxa" w:w="100"/>
+              <w:bottom w:type="dxa" w:w="80"/>
+              <w:right w:type="dxa" w:w="100"/>
+            </w:tcMar>
+          </w:tcPr>
+          <w:p>
+            <w:pPr>
+              <w:jc w:val="left"/>
+            </w:pPr>
+            <w:r>
+              <w:rPr>
+                <w:b w:val="false"/>
+                <w:bCs w:val="false"/>
+                <w:i w:val="false"/>
+                <w:iCs w:val="false"/>
+                <w:sz w:val="20"/>
+                <w:szCs w:val="20"/>
+              </w:rPr>
+              <w:t xml:space="preserve"/>
+            </w:r>
+          </w:p>
+        </w:tc>
+        <w:tc>
+          <w:tcPr>
+            <w:tcW w:type="dxa" w:w="5174"/>
+            <w:tcMar>
+              <w:top w:type="dxa" w:w="80"/>
+              <w:left w:type="dxa" w:w="100"/>
+              <w:bottom w:type="dxa" w:w="80"/>
+              <w:right w:type="dxa" w:w="100"/>
+            </w:tcMar>
+          </w:tcPr>
+          <w:p>
+            <w:pPr>
+              <w:jc w:val="left"/>
+            </w:pPr>
+            <w:r>
+              <w:rPr>
+                <w:b w:val="false"/>
+                <w:bCs w:val="false"/>
+                <w:i w:val="false"/>
+                <w:iCs w:val="false"/>
+                <w:sz w:val="20"/>
+                <w:szCs w:val="20"/>
+              </w:rPr>
+              <w:t xml:space="preserve">Total</w:t>
+            </w:r>
+          </w:p>
+        </w:tc>
+        <w:tc>
+          <w:tcPr>
+            <w:tcW w:type="dxa" w:w="913"/>
+            <w:tcMar>
+              <w:top w:type="dxa" w:w="80"/>
+              <w:left w:type="dxa" w:w="100"/>
+              <w:bottom w:type="dxa" w:w="80"/>
+              <w:right w:type="dxa" w:w="100"/>
+            </w:tcMar>
+          </w:tcPr>
+          <w:p>
+            <w:pPr>
+              <w:jc w:val="left"/>
+            </w:pPr>
+            <w:r>
+              <w:rPr>
+                <w:b w:val="false"/>
+                <w:bCs w:val="false"/>
+                <w:i w:val="false"/>
+                <w:iCs w:val="false"/>
+                <w:sz w:val="20"/>
+                <w:szCs w:val="20"/>
+              </w:rPr>
+              <w:t xml:space="preserve">100</w:t>
             </w:r>
           </w:p>
         </w:tc>

</xml_diff>

<commit_message>
docs: new MLflow screenshots for the validation-based model selection
- 02_mlflow_comparison.png: the three runs compared on valid_pr_auc and
  single_row_p95_ms, the two numbers the selection rule uses
- 03_mlflow_registry.png: version 3 holding the champion alias, with the
  selection_rule, thresholds and test_pr_auc tags

Both cropped to remove the browser bookmarks bar and a notification
(personal/employer details) before they go into the submitted report.
Updated the Figure 6/7 captions in the report and SCREENSHOT_CAPTIONS.md
to describe the new images; regenerated 13.docx/13.pdf (schema-valid,
17 pages, no blanks).
</commit_message>
<xml_diff>
--- a/13.docx
+++ b/13.docx
@@ -6887,7 +6887,7 @@
       <w:r>
         <w:drawing>
           <wp:inline distT="0" distB="0" distL="0" distR="0">
-            <wp:extent cx="6124575" cy="3552825"/>
+            <wp:extent cx="6124575" cy="3676650"/>
             <wp:effectExtent t="0" r="0" b="0" l="0"/>
             <wp:docPr id="6" name="" descr="" title=""/>
             <wp:cNvGraphicFramePr>
@@ -6912,7 +6912,7 @@
                   <pic:spPr bwMode="auto">
                     <a:xfrm>
                       <a:off x="0" y="0"/>
-                      <a:ext cx="6124575" cy="3552825"/>
+                      <a:ext cx="6124575" cy="3676650"/>
                     </a:xfrm>
                     <a:prstGeom prst="rect">
                       <a:avLst/>
@@ -6937,7 +6937,7 @@
           <w:sz w:val="20"/>
           <w:szCs w:val="20"/>
         </w:rPr>
-        <w:t xml:space="preserve">Figure 6. MLflow comparing the three trained models' runs side by side. LightGBM and Random Forest are effectively tied on accuracy; Section 7.3 explains how LightGBM was chosen between them.</w:t>
+        <w:t xml:space="preserve">Figure 6. MLflow comparing the three runs on the two numbers the selection rule uses: validation PR-AUC (left axis) and p95 time to score one payment (right axis). LightGBM and Random Forest both reach about 1.000 PR-AUC, but LightGBM's line ends at the bottom (0.28 ms) and Random Forest's at the top (3.49 ms); Logistic Regression starts lower at 0.924. See Section 7.3.</w:t>
       </w:r>
     </w:p>
     <w:p>
@@ -6948,7 +6948,7 @@
       <w:r>
         <w:drawing>
           <wp:inline distT="0" distB="0" distL="0" distR="0">
-            <wp:extent cx="6124575" cy="3200400"/>
+            <wp:extent cx="6124575" cy="2533650"/>
             <wp:effectExtent t="0" r="0" b="0" l="0"/>
             <wp:docPr id="7" name="" descr="" title=""/>
             <wp:cNvGraphicFramePr>
@@ -6973,7 +6973,7 @@
                   <pic:spPr bwMode="auto">
                     <a:xfrm>
                       <a:off x="0" y="0"/>
-                      <a:ext cx="6124575" cy="3200400"/>
+                      <a:ext cx="6124575" cy="2533650"/>
                     </a:xfrm>
                     <a:prstGeom prst="rect">
                       <a:avLst/>
@@ -6998,7 +6998,7 @@
           <w:sz w:val="20"/>
           <w:szCs w:val="20"/>
         </w:rPr>
-        <w:t xml:space="preserve">Figure 7. The registered model fraud-triage-model, version 1, aliased champion — scoring-service always loads whichever version currently holds this alias.</w:t>
+        <w:t xml:space="preserve">Figure 7. The registered model fraud-triage-model, version 3, holding the champion alias. Its tags record the selection rule, the cost-based thresholds and the test PR-AUC (0.9997) that passed the quality gate; scoring-service always loads whichever version holds this alias.</w:t>
       </w:r>
     </w:p>
     <w:p>

</xml_diff>